<commit_message>
Code Breaker Assignment: Intermediate Upload over Easter
</commit_message>
<xml_diff>
--- a/Antony Gibson CS12320 Assignment Documentation.docx
+++ b/Antony Gibson CS12320 Assignment Documentation.docx
@@ -190,6 +190,24 @@
           <w:szCs w:val="36"/>
         </w:rPr>
       </w:pPr>
+      <w:r>
+        <w:rPr>
+          <w:b/>
+          <w:bCs/>
+          <w:sz w:val="36"/>
+          <w:szCs w:val="36"/>
+        </w:rPr>
+        <w:t>Date</w:t>
+      </w:r>
+      <w:r>
+        <w:rPr>
+          <w:b/>
+          <w:bCs/>
+          <w:sz w:val="36"/>
+          <w:szCs w:val="36"/>
+        </w:rPr>
+        <w:t xml:space="preserve">: </w:t>
+      </w:r>
     </w:p>
     <w:p>
       <w:pPr>
@@ -2727,11 +2745,66 @@
     </w:p>
     <w:p>
       <w:pPr>
-        <w:rPr>
-          <w:sz w:val="28"/>
-          <w:szCs w:val="28"/>
-        </w:rPr>
-      </w:pPr>
+        <w:pBdr>
+          <w:top w:val="single" w:sz="4" w:space="1" w:color="auto"/>
+          <w:left w:val="single" w:sz="4" w:space="4" w:color="auto"/>
+          <w:bottom w:val="single" w:sz="4" w:space="1" w:color="auto"/>
+          <w:right w:val="single" w:sz="4" w:space="4" w:color="auto"/>
+        </w:pBdr>
+        <w:rPr>
+          <w:sz w:val="28"/>
+          <w:szCs w:val="28"/>
+        </w:rPr>
+      </w:pPr>
+      <w:r>
+        <w:rPr>
+          <w:sz w:val="28"/>
+          <w:szCs w:val="28"/>
+        </w:rPr>
+        <w:t>Program Exit Codes:</w:t>
+      </w:r>
+    </w:p>
+    <w:p>
+      <w:pPr>
+        <w:pBdr>
+          <w:top w:val="single" w:sz="4" w:space="1" w:color="auto"/>
+          <w:left w:val="single" w:sz="4" w:space="4" w:color="auto"/>
+          <w:bottom w:val="single" w:sz="4" w:space="1" w:color="auto"/>
+          <w:right w:val="single" w:sz="4" w:space="4" w:color="auto"/>
+        </w:pBdr>
+        <w:rPr>
+          <w:sz w:val="28"/>
+          <w:szCs w:val="28"/>
+        </w:rPr>
+      </w:pPr>
+      <w:r>
+        <w:rPr>
+          <w:sz w:val="28"/>
+          <w:szCs w:val="28"/>
+        </w:rPr>
+        <w:t>0 – User chose to close the program</w:t>
+      </w:r>
+    </w:p>
+    <w:p>
+      <w:pPr>
+        <w:pBdr>
+          <w:top w:val="single" w:sz="4" w:space="1" w:color="auto"/>
+          <w:left w:val="single" w:sz="4" w:space="4" w:color="auto"/>
+          <w:bottom w:val="single" w:sz="4" w:space="1" w:color="auto"/>
+          <w:right w:val="single" w:sz="4" w:space="4" w:color="auto"/>
+        </w:pBdr>
+        <w:rPr>
+          <w:sz w:val="28"/>
+          <w:szCs w:val="28"/>
+        </w:rPr>
+      </w:pPr>
+      <w:r>
+        <w:rPr>
+          <w:sz w:val="28"/>
+          <w:szCs w:val="28"/>
+        </w:rPr>
+        <w:t>1 – Error forced closure of the program</w:t>
+      </w:r>
     </w:p>
     <w:p>
       <w:pPr>
@@ -2897,7 +2970,6 @@
           <w:sz w:val="36"/>
           <w:szCs w:val="36"/>
         </w:rPr>
-        <w:lastRenderedPageBreak/>
         <w:t>Testing</w:t>
       </w:r>
     </w:p>
@@ -3119,7 +3191,6 @@
           <w:sz w:val="36"/>
           <w:szCs w:val="36"/>
         </w:rPr>
-        <w:lastRenderedPageBreak/>
         <w:t>Evaluation</w:t>
       </w:r>
     </w:p>
@@ -3334,7 +3405,6 @@
           <w:sz w:val="36"/>
           <w:szCs w:val="36"/>
         </w:rPr>
-        <w:lastRenderedPageBreak/>
         <w:t>Appendix</w:t>
       </w:r>
     </w:p>
@@ -3519,7 +3589,6 @@
     <w:p/>
     <w:p>
       <w:r>
-        <w:lastRenderedPageBreak/>
         <w:t>Use Case Tables and Diagrams:</w:t>
       </w:r>
     </w:p>
@@ -4065,7 +4134,6 @@
           <w:sz w:val="28"/>
           <w:szCs w:val="28"/>
         </w:rPr>
-        <w:lastRenderedPageBreak/>
         <w:drawing>
           <wp:inline distT="0" distB="0" distL="0" distR="0" wp14:anchorId="58C6834A" wp14:editId="7DDFB28B">
             <wp:extent cx="5731510" cy="5142865"/>

</xml_diff>